<commit_message>
Segunda corrida Alcance Tecnico SEO (Word)
</commit_message>
<xml_diff>
--- a/descargables/Alcance-Tecnico-SEO.docx
+++ b/descargables/Alcance-Tecnico-SEO.docx
@@ -3,79 +3,839 @@
 <w:document xmlns:wpc="http://schemas.microsoft.com/office/word/2010/wordprocessingCanvas" xmlns:mo="http://schemas.microsoft.com/office/mac/office/2008/main" xmlns:mc="http://schemas.openxmlformats.org/markup-compatibility/2006" xmlns:mv="urn:schemas-microsoft-com:mac:vml" xmlns:o="urn:schemas-microsoft-com:office:office" xmlns:r="http://schemas.openxmlformats.org/officeDocument/2006/relationships" xmlns:m="http://schemas.openxmlformats.org/officeDocument/2006/math" xmlns:v="urn:schemas-microsoft-com:vml" xmlns:wp14="http://schemas.microsoft.com/office/word/2010/wordprocessingDrawing" xmlns:wp="http://schemas.openxmlformats.org/drawingml/2006/wordprocessingDrawing" xmlns:w10="urn:schemas-microsoft-com:office:word" xmlns:w="http://schemas.openxmlformats.org/wordprocessingml/2006/main" xmlns:w14="http://schemas.microsoft.com/office/word/2010/wordml" xmlns:wpg="http://schemas.microsoft.com/office/word/2010/wordprocessingGroup" xmlns:wpi="http://schemas.microsoft.com/office/word/2010/wordprocessingInk" xmlns:wne="http://schemas.microsoft.com/office/word/2006/wordml" xmlns:wps="http://schemas.microsoft.com/office/word/2010/wordprocessingShape" mc:Ignorable="w14 wp14">
   <w:body>
     <w:p>
+      <w:pPr>
+        <w:pStyle w:val="Title"/>
+      </w:pPr>
       <w:r>
-        <w:rPr>
-          <w:b/>
-          <w:color w:val="2C3A63"/>
-          <w:sz w:val="44"/>
-        </w:rPr>
         <w:t>Alcance Técnico — SEO</w:t>
       </w:r>
     </w:p>
     <w:p>
       <w:r>
         <w:rPr>
-          <w:color w:val="55594C"/>
-          <w:sz w:val="20"/>
+          <w:b/>
         </w:rPr>
-        <w:t>Sitio: defensordelcontribuyente.cl</w:t>
+        <w:t xml:space="preserve">Sitio: </w:t>
+      </w:r>
+      <w:r>
+        <w:t>www.defensordelcontribuyente.cl (redirige correctamente a defensordelcontribuyente.cl)</w:t>
+        <w:br/>
+      </w:r>
+      <w:r>
+        <w:rPr>
+          <w:b/>
+        </w:rPr>
+        <w:t xml:space="preserve">Fecha: </w:t>
+      </w:r>
+      <w:r>
+        <w:t>19 de agosto de 2026 (segunda corrida — línea base: 17 de agosto de 2026)</w:t>
+        <w:br/>
+      </w:r>
+      <w:r>
+        <w:rPr>
+          <w:b/>
+        </w:rPr>
+        <w:t xml:space="preserve">Preparado para: </w:t>
+      </w:r>
+      <w:r>
+        <w:t>equipo de marketing entrante</w:t>
       </w:r>
     </w:p>
     <w:p>
+      <w:pPr>
+        <w:pStyle w:val="Heading1"/>
+      </w:pPr>
       <w:r>
-        <w:rPr>
-          <w:color w:val="55594C"/>
-          <w:sz w:val="20"/>
-        </w:rPr>
-        <w:t>Fecha: 17 de agosto de 2026</w:t>
-      </w:r>
-    </w:p>
-    <w:p>
-      <w:r>
-        <w:rPr>
-          <w:color w:val="55594C"/>
-          <w:sz w:val="20"/>
-        </w:rPr>
-        <w:t>Preparado para: equipo de marketing entrante</w:t>
-      </w:r>
-    </w:p>
-    <w:p/>
-    <w:p>
-      <w:r>
-        <w:rPr>
-          <w:b/>
-          <w:color w:val="2C3A63"/>
-          <w:sz w:val="28"/>
-        </w:rPr>
         <w:t>Resumen del alcance</w:t>
       </w:r>
     </w:p>
     <w:p>
       <w:r>
-        <w:rPr>
-          <w:color w:val="1A1E17"/>
-          <w:sz w:val="22"/>
-        </w:rPr>
-        <w:t>Este documento detalla las modificaciones técnicas de SEO que deben ejecutarse sobre defensordelcontribuyente.cl, ordenadas por prioridad. Corresponde a la línea base de trabajo previa a la toma de la cuenta.</w:t>
+        <w:t>Este documento detalla las modificaciones técnicas de SEO que deben ejecutarse sobre defensordelcontribuyente.cl, ordenadas por prioridad. Esta segunda corrida repite la auditoría íntegra usando la metodología profesional de 8 categorías ponderadas y confirma, hallazgo por hallazgo, qué sigue pendiente desde la línea base del 17-08-2026.</w:t>
+      </w:r>
+    </w:p>
+    <w:p>
+      <w:pPr>
+        <w:pStyle w:val="Heading1"/>
+      </w:pPr>
+      <w:r>
+        <w:t>Puntuación profesional: 69/100</w:t>
       </w:r>
     </w:p>
     <w:p>
       <w:r>
-        <w:rPr>
-          <w:b/>
-          <w:color w:val="2C3A63"/>
-          <w:sz w:val="28"/>
-        </w:rPr>
-        <w:t>Prioridad 1 — Medición y tracking (crítico)</w:t>
+        <w:t>Nota metodológica: Lighthouse le da a esta misma página SEO 100/100 porque solo mide crawlability técnica básica. La puntuación de abajo es más amplia — incorpora imágenes, redes sociales, datos estructurados y deuda técnica real, que es donde está la mayoría de las oportunidades.</w:t>
       </w:r>
     </w:p>
+    <w:tbl>
+      <w:tblPr>
+        <w:tblStyle w:val="LightGrid-Accent1"/>
+        <w:tblW w:type="auto" w:w="0"/>
+        <w:tblLook w:firstColumn="1" w:firstRow="1" w:lastColumn="0" w:lastRow="0" w:noHBand="0" w:noVBand="1" w:val="04A0"/>
+      </w:tblPr>
+      <w:tblGrid>
+        <w:gridCol w:w="2160"/>
+        <w:gridCol w:w="2160"/>
+        <w:gridCol w:w="2160"/>
+        <w:gridCol w:w="2160"/>
+      </w:tblGrid>
+      <w:tr>
+        <w:tc>
+          <w:tcPr>
+            <w:tcW w:type="dxa" w:w="2160"/>
+          </w:tcPr>
+          <w:p>
+            <w:r>
+              <w:t>Categoría</w:t>
+            </w:r>
+          </w:p>
+        </w:tc>
+        <w:tc>
+          <w:tcPr>
+            <w:tcW w:type="dxa" w:w="2160"/>
+          </w:tcPr>
+          <w:p>
+            <w:r>
+              <w:t>Peso</w:t>
+            </w:r>
+          </w:p>
+        </w:tc>
+        <w:tc>
+          <w:tcPr>
+            <w:tcW w:type="dxa" w:w="2160"/>
+          </w:tcPr>
+          <w:p>
+            <w:r>
+              <w:t>Puntaje</w:t>
+            </w:r>
+          </w:p>
+        </w:tc>
+        <w:tc>
+          <w:tcPr>
+            <w:tcW w:type="dxa" w:w="2160"/>
+          </w:tcPr>
+          <w:p>
+            <w:r>
+              <w:t>Motivo</w:t>
+            </w:r>
+          </w:p>
+        </w:tc>
+      </w:tr>
+      <w:tr>
+        <w:tc>
+          <w:tcPr>
+            <w:tcW w:type="dxa" w:w="2160"/>
+          </w:tcPr>
+          <w:p>
+            <w:r>
+              <w:t>Meta Tags</w:t>
+            </w:r>
+          </w:p>
+        </w:tc>
+        <w:tc>
+          <w:tcPr>
+            <w:tcW w:type="dxa" w:w="2160"/>
+          </w:tcPr>
+          <w:p>
+            <w:r>
+              <w:t>20%</w:t>
+            </w:r>
+          </w:p>
+        </w:tc>
+        <w:tc>
+          <w:tcPr>
+            <w:tcW w:type="dxa" w:w="2160"/>
+          </w:tcPr>
+          <w:p>
+            <w:r>
+              <w:t>88/100</w:t>
+            </w:r>
+          </w:p>
+        </w:tc>
+        <w:tc>
+          <w:tcPr>
+            <w:tcW w:type="dxa" w:w="2160"/>
+          </w:tcPr>
+          <w:p>
+            <w:r>
+              <w:t>Title (55 car.) y meta description (135 car., bajo el rango 150-160) presentes y persuasivos. Canonical, robots meta, viewport y lang correctos.</w:t>
+            </w:r>
+          </w:p>
+        </w:tc>
+      </w:tr>
+      <w:tr>
+        <w:tc>
+          <w:tcPr>
+            <w:tcW w:type="dxa" w:w="2160"/>
+          </w:tcPr>
+          <w:p>
+            <w:r>
+              <w:t>Headings</w:t>
+            </w:r>
+          </w:p>
+        </w:tc>
+        <w:tc>
+          <w:tcPr>
+            <w:tcW w:type="dxa" w:w="2160"/>
+          </w:tcPr>
+          <w:p>
+            <w:r>
+              <w:t>15%</w:t>
+            </w:r>
+          </w:p>
+        </w:tc>
+        <w:tc>
+          <w:tcPr>
+            <w:tcW w:type="dxa" w:w="2160"/>
+          </w:tcPr>
+          <w:p>
+            <w:r>
+              <w:t>95/100</w:t>
+            </w:r>
+          </w:p>
+        </w:tc>
+        <w:tc>
+          <w:tcPr>
+            <w:tcW w:type="dxa" w:w="2160"/>
+          </w:tcPr>
+          <w:p>
+            <w:r>
+              <w:t>Exactamente 1 H1 ("Abogado tributario") en la home, sin salto de jerarquia detectado.</w:t>
+            </w:r>
+          </w:p>
+        </w:tc>
+      </w:tr>
+      <w:tr>
+        <w:tc>
+          <w:tcPr>
+            <w:tcW w:type="dxa" w:w="2160"/>
+          </w:tcPr>
+          <w:p>
+            <w:r>
+              <w:t>Imágenes</w:t>
+            </w:r>
+          </w:p>
+        </w:tc>
+        <w:tc>
+          <w:tcPr>
+            <w:tcW w:type="dxa" w:w="2160"/>
+          </w:tcPr>
+          <w:p>
+            <w:r>
+              <w:t>10%</w:t>
+            </w:r>
+          </w:p>
+        </w:tc>
+        <w:tc>
+          <w:tcPr>
+            <w:tcW w:type="dxa" w:w="2160"/>
+          </w:tcPr>
+          <w:p>
+            <w:r>
+              <w:t>40/100</w:t>
+            </w:r>
+          </w:p>
+        </w:tc>
+        <w:tc>
+          <w:tcPr>
+            <w:tcW w:type="dxa" w:w="2160"/>
+          </w:tcPr>
+          <w:p>
+            <w:r>
+              <w:t>66 imagenes en la home, solo 28 con alt (42%) y 27 con lazy loading (41%).</w:t>
+            </w:r>
+          </w:p>
+        </w:tc>
+      </w:tr>
+      <w:tr>
+        <w:tc>
+          <w:tcPr>
+            <w:tcW w:type="dxa" w:w="2160"/>
+          </w:tcPr>
+          <w:p>
+            <w:r>
+              <w:t>Enlaces</w:t>
+            </w:r>
+          </w:p>
+        </w:tc>
+        <w:tc>
+          <w:tcPr>
+            <w:tcW w:type="dxa" w:w="2160"/>
+          </w:tcPr>
+          <w:p>
+            <w:r>
+              <w:t>10%</w:t>
+            </w:r>
+          </w:p>
+        </w:tc>
+        <w:tc>
+          <w:tcPr>
+            <w:tcW w:type="dxa" w:w="2160"/>
+          </w:tcPr>
+          <w:p>
+            <w:r>
+              <w:t>85/100</w:t>
+            </w:r>
+          </w:p>
+        </w:tc>
+        <w:tc>
+          <w:tcPr>
+            <w:tcW w:type="dxa" w:w="2160"/>
+          </w:tcPr>
+          <w:p>
+            <w:r>
+              <w:t>0 enlaces rotos en la muestra de 20 URL de navegacion verificadas. 2 enlaces de menu (/servicios, /blog) sin barra final generan un salto 301 evitable.</w:t>
+            </w:r>
+          </w:p>
+        </w:tc>
+      </w:tr>
+      <w:tr>
+        <w:tc>
+          <w:tcPr>
+            <w:tcW w:type="dxa" w:w="2160"/>
+          </w:tcPr>
+          <w:p>
+            <w:r>
+              <w:t>Open Graph y Social</w:t>
+            </w:r>
+          </w:p>
+        </w:tc>
+        <w:tc>
+          <w:tcPr>
+            <w:tcW w:type="dxa" w:w="2160"/>
+          </w:tcPr>
+          <w:p>
+            <w:r>
+              <w:t>10%</w:t>
+            </w:r>
+          </w:p>
+        </w:tc>
+        <w:tc>
+          <w:tcPr>
+            <w:tcW w:type="dxa" w:w="2160"/>
+          </w:tcPr>
+          <w:p>
+            <w:r>
+              <w:t>55/100</w:t>
+            </w:r>
+          </w:p>
+        </w:tc>
+        <w:tc>
+          <w:tcPr>
+            <w:tcW w:type="dxa" w:w="2160"/>
+          </w:tcPr>
+          <w:p>
+            <w:r>
+              <w:t>Open Graph completo pero con imagen cuadrada (1080x1080, deberia ser 1200x630). Twitter Card solo declara el tipo, sin title/description/image propios.</w:t>
+            </w:r>
+          </w:p>
+        </w:tc>
+      </w:tr>
+      <w:tr>
+        <w:tc>
+          <w:tcPr>
+            <w:tcW w:type="dxa" w:w="2160"/>
+          </w:tcPr>
+          <w:p>
+            <w:r>
+              <w:t>Schema / Datos Estructurados</w:t>
+            </w:r>
+          </w:p>
+        </w:tc>
+        <w:tc>
+          <w:tcPr>
+            <w:tcW w:type="dxa" w:w="2160"/>
+          </w:tcPr>
+          <w:p>
+            <w:r>
+              <w:t>10%</w:t>
+            </w:r>
+          </w:p>
+        </w:tc>
+        <w:tc>
+          <w:tcPr>
+            <w:tcW w:type="dxa" w:w="2160"/>
+          </w:tcPr>
+          <w:p>
+            <w:r>
+              <w:t>65/100</w:t>
+            </w:r>
+          </w:p>
+        </w:tc>
+        <w:tc>
+          <w:tcPr>
+            <w:tcW w:type="dxa" w:w="2160"/>
+          </w:tcPr>
+          <w:p>
+            <w:r>
+              <w:t>Organization, WebSite, WebPage, BreadcrumbList e ImageObject bien formados. Falta LocalBusiness y schema Service en las paginas de servicio.</w:t>
+            </w:r>
+          </w:p>
+        </w:tc>
+      </w:tr>
+      <w:tr>
+        <w:tc>
+          <w:tcPr>
+            <w:tcW w:type="dxa" w:w="2160"/>
+          </w:tcPr>
+          <w:p>
+            <w:r>
+              <w:t>Técnico</w:t>
+            </w:r>
+          </w:p>
+        </w:tc>
+        <w:tc>
+          <w:tcPr>
+            <w:tcW w:type="dxa" w:w="2160"/>
+          </w:tcPr>
+          <w:p>
+            <w:r>
+              <w:t>15%</w:t>
+            </w:r>
+          </w:p>
+        </w:tc>
+        <w:tc>
+          <w:tcPr>
+            <w:tcW w:type="dxa" w:w="2160"/>
+          </w:tcPr>
+          <w:p>
+            <w:r>
+              <w:t>45/100</w:t>
+            </w:r>
+          </w:p>
+        </w:tc>
+        <w:tc>
+          <w:tcPr>
+            <w:tcW w:type="dxa" w:w="2160"/>
+          </w:tcPr>
+          <w:p>
+            <w:r>
+              <w:t>HTTPS, robots.txt, sitemap (via sitemap_index.xml) y redireccion www correctos, con servidor rapido (145ms TTFB). Pesan en contra: 51 hojas de estilo CSS, LCP de 12.4s, sin header HSTS, favicon en 404 y GTM duplicado.</w:t>
+            </w:r>
+          </w:p>
+        </w:tc>
+      </w:tr>
+      <w:tr>
+        <w:tc>
+          <w:tcPr>
+            <w:tcW w:type="dxa" w:w="2160"/>
+          </w:tcPr>
+          <w:p>
+            <w:r>
+              <w:t>Contenido</w:t>
+            </w:r>
+          </w:p>
+        </w:tc>
+        <w:tc>
+          <w:tcPr>
+            <w:tcW w:type="dxa" w:w="2160"/>
+          </w:tcPr>
+          <w:p>
+            <w:r>
+              <w:t>10%</w:t>
+            </w:r>
+          </w:p>
+        </w:tc>
+        <w:tc>
+          <w:tcPr>
+            <w:tcW w:type="dxa" w:w="2160"/>
+          </w:tcPr>
+          <w:p>
+            <w:r>
+              <w:t>60/100</w:t>
+            </w:r>
+          </w:p>
+        </w:tc>
+        <w:tc>
+          <w:tcPr>
+            <w:tcW w:type="dxa" w:w="2160"/>
+          </w:tcPr>
+          <w:p>
+            <w:r>
+              <w:t>801 palabras visibles en la home (sobre el minimo de 300), pero ratio texto/HTML muy bajo (~2%) por el peso de CSS/JS de Elementor.</w:t>
+            </w:r>
+          </w:p>
+        </w:tc>
+      </w:tr>
+    </w:tbl>
     <w:p>
+      <w:pPr>
+        <w:pStyle w:val="Heading1"/>
+      </w:pPr>
       <w:r>
-        <w:rPr>
-          <w:color w:val="1A1E17"/>
-          <w:sz w:val="22"/>
-        </w:rPr>
-        <w:t>El sitio carga actualmente dos contenedores de Google Tag Manager en simultáneo, además de un tag de Google Ads fuera de ambos. Antes de cualquier optimización de contenido, se requiere:</w:t>
+        <w:t>Qué sigue vigente desde la línea base del 17-08-2026</w:t>
+      </w:r>
+    </w:p>
+    <w:tbl>
+      <w:tblPr>
+        <w:tblStyle w:val="LightGrid-Accent1"/>
+        <w:tblW w:type="auto" w:w="0"/>
+        <w:tblLook w:firstColumn="1" w:firstRow="1" w:lastColumn="0" w:lastRow="0" w:noHBand="0" w:noVBand="1" w:val="04A0"/>
+      </w:tblPr>
+      <w:tblGrid>
+        <w:gridCol w:w="2880"/>
+        <w:gridCol w:w="2880"/>
+        <w:gridCol w:w="2880"/>
+      </w:tblGrid>
+      <w:tr>
+        <w:tc>
+          <w:tcPr>
+            <w:tcW w:type="dxa" w:w="2880"/>
+          </w:tcPr>
+          <w:p>
+            <w:r>
+              <w:t>Hallazgo</w:t>
+            </w:r>
+          </w:p>
+        </w:tc>
+        <w:tc>
+          <w:tcPr>
+            <w:tcW w:type="dxa" w:w="2880"/>
+          </w:tcPr>
+          <w:p>
+            <w:r>
+              <w:t>Estado</w:t>
+            </w:r>
+          </w:p>
+        </w:tc>
+        <w:tc>
+          <w:tcPr>
+            <w:tcW w:type="dxa" w:w="2880"/>
+          </w:tcPr>
+          <w:p>
+            <w:r>
+              <w:t>Verificación de hoy</w:t>
+            </w:r>
+          </w:p>
+        </w:tc>
+      </w:tr>
+      <w:tr>
+        <w:tc>
+          <w:tcPr>
+            <w:tcW w:type="dxa" w:w="2880"/>
+          </w:tcPr>
+          <w:p>
+            <w:r>
+              <w:t>GTM duplicado (GTM-N7BQZZW + GTM-MQC692WV)</w:t>
+            </w:r>
+          </w:p>
+        </w:tc>
+        <w:tc>
+          <w:tcPr>
+            <w:tcW w:type="dxa" w:w="2880"/>
+          </w:tcPr>
+          <w:p>
+            <w:r>
+              <w:t>Persiste</w:t>
+            </w:r>
+          </w:p>
+        </w:tc>
+        <w:tc>
+          <w:tcPr>
+            <w:tcW w:type="dxa" w:w="2880"/>
+          </w:tcPr>
+          <w:p>
+            <w:r>
+              <w:t>Confirmado en el HTML de hoy.</w:t>
+            </w:r>
+          </w:p>
+        </w:tc>
+      </w:tr>
+      <w:tr>
+        <w:tc>
+          <w:tcPr>
+            <w:tcW w:type="dxa" w:w="2880"/>
+          </w:tcPr>
+          <w:p>
+            <w:r>
+              <w:t>51 hojas de estilo CSS en la home</w:t>
+            </w:r>
+          </w:p>
+        </w:tc>
+        <w:tc>
+          <w:tcPr>
+            <w:tcW w:type="dxa" w:w="2880"/>
+          </w:tcPr>
+          <w:p>
+            <w:r>
+              <w:t>Persiste (empeoro levemente: 50 -&gt; 51)</w:t>
+            </w:r>
+          </w:p>
+        </w:tc>
+        <w:tc>
+          <w:tcPr>
+            <w:tcW w:type="dxa" w:w="2880"/>
+          </w:tcPr>
+          <w:p>
+            <w:r>
+              <w:t>Confirmado por conteo directo.</w:t>
+            </w:r>
+          </w:p>
+        </w:tc>
+      </w:tr>
+      <w:tr>
+        <w:tc>
+          <w:tcPr>
+            <w:tcW w:type="dxa" w:w="2880"/>
+          </w:tcPr>
+          <w:p>
+            <w:r>
+              <w:t>58% de imagenes sin alt</w:t>
+            </w:r>
+          </w:p>
+        </w:tc>
+        <w:tc>
+          <w:tcPr>
+            <w:tcW w:type="dxa" w:w="2880"/>
+          </w:tcPr>
+          <w:p>
+            <w:r>
+              <w:t>Persiste</w:t>
+            </w:r>
+          </w:p>
+        </w:tc>
+        <w:tc>
+          <w:tcPr>
+            <w:tcW w:type="dxa" w:w="2880"/>
+          </w:tcPr>
+          <w:p>
+            <w:r>
+              <w:t>42% con alt hoy (28 de 66), igual que la auditoria base.</w:t>
+            </w:r>
+          </w:p>
+        </w:tc>
+      </w:tr>
+      <w:tr>
+        <w:tc>
+          <w:tcPr>
+            <w:tcW w:type="dxa" w:w="2880"/>
+          </w:tcPr>
+          <w:p>
+            <w:r>
+              <w:t>Imagen Open Graph cuadrada</w:t>
+            </w:r>
+          </w:p>
+        </w:tc>
+        <w:tc>
+          <w:tcPr>
+            <w:tcW w:type="dxa" w:w="2880"/>
+          </w:tcPr>
+          <w:p>
+            <w:r>
+              <w:t>Persiste</w:t>
+            </w:r>
+          </w:p>
+        </w:tc>
+        <w:tc>
+          <w:tcPr>
+            <w:tcW w:type="dxa" w:w="2880"/>
+          </w:tcPr>
+          <w:p>
+            <w:r>
+              <w:t>1080x1080 confirmado.</w:t>
+            </w:r>
+          </w:p>
+        </w:tc>
+      </w:tr>
+      <w:tr>
+        <w:tc>
+          <w:tcPr>
+            <w:tcW w:type="dxa" w:w="2880"/>
+          </w:tcPr>
+          <w:p>
+            <w:r>
+              <w:t>Twitter Cards incompletas</w:t>
+            </w:r>
+          </w:p>
+        </w:tc>
+        <w:tc>
+          <w:tcPr>
+            <w:tcW w:type="dxa" w:w="2880"/>
+          </w:tcPr>
+          <w:p>
+            <w:r>
+              <w:t>Persiste</w:t>
+            </w:r>
+          </w:p>
+        </w:tc>
+        <w:tc>
+          <w:tcPr>
+            <w:tcW w:type="dxa" w:w="2880"/>
+          </w:tcPr>
+          <w:p>
+            <w:r>
+              <w:t>Solo twitter:card presente.</w:t>
+            </w:r>
+          </w:p>
+        </w:tc>
+      </w:tr>
+      <w:tr>
+        <w:tc>
+          <w:tcPr>
+            <w:tcW w:type="dxa" w:w="2880"/>
+          </w:tcPr>
+          <w:p>
+            <w:r>
+              <w:t>Header Strict-Transport-Security ausente</w:t>
+            </w:r>
+          </w:p>
+        </w:tc>
+        <w:tc>
+          <w:tcPr>
+            <w:tcW w:type="dxa" w:w="2880"/>
+          </w:tcPr>
+          <w:p>
+            <w:r>
+              <w:t>Persiste</w:t>
+            </w:r>
+          </w:p>
+        </w:tc>
+        <w:tc>
+          <w:tcPr>
+            <w:tcW w:type="dxa" w:w="2880"/>
+          </w:tcPr>
+          <w:p>
+            <w:r>
+              <w:t>No aparece en los headers de respuesta.</w:t>
+            </w:r>
+          </w:p>
+        </w:tc>
+      </w:tr>
+      <w:tr>
+        <w:tc>
+          <w:tcPr>
+            <w:tcW w:type="dxa" w:w="2880"/>
+          </w:tcPr>
+          <w:p>
+            <w:r>
+              <w:t>Favicon.ico en 404</w:t>
+            </w:r>
+          </w:p>
+        </w:tc>
+        <w:tc>
+          <w:tcPr>
+            <w:tcW w:type="dxa" w:w="2880"/>
+          </w:tcPr>
+          <w:p>
+            <w:r>
+              <w:t>Persiste</w:t>
+            </w:r>
+          </w:p>
+        </w:tc>
+        <w:tc>
+          <w:tcPr>
+            <w:tcW w:type="dxa" w:w="2880"/>
+          </w:tcPr>
+          <w:p>
+            <w:r>
+              <w:t>HTTP 404 confirmado.</w:t>
+            </w:r>
+          </w:p>
+        </w:tc>
+      </w:tr>
+      <w:tr>
+        <w:tc>
+          <w:tcPr>
+            <w:tcW w:type="dxa" w:w="2880"/>
+          </w:tcPr>
+          <w:p>
+            <w:r>
+              <w:t>Enlaces de menu sin barra final (/servicios, /blog)</w:t>
+            </w:r>
+          </w:p>
+        </w:tc>
+        <w:tc>
+          <w:tcPr>
+            <w:tcW w:type="dxa" w:w="2880"/>
+          </w:tcPr>
+          <w:p>
+            <w:r>
+              <w:t>Persiste</w:t>
+            </w:r>
+          </w:p>
+        </w:tc>
+        <w:tc>
+          <w:tcPr>
+            <w:tcW w:type="dxa" w:w="2880"/>
+          </w:tcPr>
+          <w:p>
+            <w:r>
+              <w:t>Confirmado: ambos responden 301.</w:t>
+            </w:r>
+          </w:p>
+        </w:tc>
+      </w:tr>
+      <w:tr>
+        <w:tc>
+          <w:tcPr>
+            <w:tcW w:type="dxa" w:w="2880"/>
+          </w:tcPr>
+          <w:p>
+            <w:r>
+              <w:t>WordPress 6.8.8 / Elementor 4.1.4 / Pro 4.1.2 desactualizados</w:t>
+            </w:r>
+          </w:p>
+        </w:tc>
+        <w:tc>
+          <w:tcPr>
+            <w:tcW w:type="dxa" w:w="2880"/>
+          </w:tcPr>
+          <w:p>
+            <w:r>
+              <w:t>Persiste</w:t>
+            </w:r>
+          </w:p>
+        </w:tc>
+        <w:tc>
+          <w:tcPr>
+            <w:tcW w:type="dxa" w:w="2880"/>
+          </w:tcPr>
+          <w:p>
+            <w:r>
+              <w:t>Mismas versiones detectadas.</w:t>
+            </w:r>
+          </w:p>
+        </w:tc>
+      </w:tr>
+      <w:tr>
+        <w:tc>
+          <w:tcPr>
+            <w:tcW w:type="dxa" w:w="2880"/>
+          </w:tcPr>
+          <w:p>
+            <w:r>
+              <w:t>Schema LocalBusiness y Service ausentes</w:t>
+            </w:r>
+          </w:p>
+        </w:tc>
+        <w:tc>
+          <w:tcPr>
+            <w:tcW w:type="dxa" w:w="2880"/>
+          </w:tcPr>
+          <w:p>
+            <w:r>
+              <w:t>Persiste</w:t>
+            </w:r>
+          </w:p>
+        </w:tc>
+        <w:tc>
+          <w:tcPr>
+            <w:tcW w:type="dxa" w:w="2880"/>
+          </w:tcPr>
+          <w:p>
+            <w:r>
+              <w:t>No aparecen en el JSON-LD de la home.</w:t>
+            </w:r>
+          </w:p>
+        </w:tc>
+      </w:tr>
+    </w:tbl>
+    <w:p>
+      <w:pPr>
+        <w:pStyle w:val="Heading1"/>
+      </w:pPr>
+      <w:r>
+        <w:t>Hallazgos nuevos de esta corrida</w:t>
       </w:r>
     </w:p>
     <w:p>
@@ -83,10 +843,70 @@
         <w:pStyle w:val="ListBullet"/>
       </w:pPr>
       <w:r>
-        <w:rPr>
-          <w:color w:val="1A1E17"/>
-          <w:sz w:val="22"/>
-        </w:rPr>
+        <w:t>LCP (Largest Contentful Paint) de 12.4 segundos en la home — muy por sobre el umbral de "bueno" (2.5s).</w:t>
+      </w:r>
+    </w:p>
+    <w:p>
+      <w:pPr>
+        <w:pStyle w:val="ListBullet"/>
+      </w:pPr>
+      <w:r>
+        <w:t>Total Blocking Time de 730ms.</w:t>
+      </w:r>
+    </w:p>
+    <w:p>
+      <w:pPr>
+        <w:pStyle w:val="ListBullet"/>
+      </w:pPr>
+      <w:r>
+        <w:t>294 KiB de JavaScript sin usar cargado en cada visita (ahorro estimado ~1.76s si se elimina).</w:t>
+      </w:r>
+    </w:p>
+    <w:p>
+      <w:pPr>
+        <w:pStyle w:val="ListBullet"/>
+      </w:pPr>
+      <w:r>
+        <w:t>Ratio texto/HTML de ~2%, muy por debajo del 25% recomendado.</w:t>
+      </w:r>
+    </w:p>
+    <w:p>
+      <w:pPr>
+        <w:pStyle w:val="ListBullet"/>
+      </w:pPr>
+      <w:r>
+        <w:t>Meta description de 135 caracteres — bajo el rango óptimo de 150-160.</w:t>
+      </w:r>
+    </w:p>
+    <w:p>
+      <w:pPr>
+        <w:pStyle w:val="ListBullet"/>
+      </w:pPr>
+      <w:r>
+        <w:t>El sitemap no está en /sitemap.xml (404) sino en /sitemap_index.xml, correctamente declarado en robots.txt — es la convención estándar de Yoast, no es un error.</w:t>
+      </w:r>
+    </w:p>
+    <w:p>
+      <w:pPr>
+        <w:pStyle w:val="Heading1"/>
+      </w:pPr>
+      <w:r>
+        <w:t>Prioridad 1 — Medición y tracking (crítico)</w:t>
+      </w:r>
+    </w:p>
+    <w:p>
+      <w:pPr>
+        <w:pStyle w:val="ListBullet"/>
+      </w:pPr>
+      <w:r>
+        <w:t>Sin cambios respecto a la línea base — sigue sin resolverse:</w:t>
+      </w:r>
+    </w:p>
+    <w:p>
+      <w:pPr>
+        <w:pStyle w:val="ListBullet"/>
+      </w:pPr>
+      <w:r>
         <w:t>Consolidar la implementación de Google Tag Manager en un único contenedor.</w:t>
       </w:r>
     </w:p>
@@ -95,11 +915,7 @@
         <w:pStyle w:val="ListBullet"/>
       </w:pPr>
       <w:r>
-        <w:rPr>
-          <w:color w:val="1A1E17"/>
-          <w:sz w:val="22"/>
-        </w:rPr>
-        <w:t>Migrar el tag de conversión de Google Ads (ID de conversión AW-593050363) dentro del contenedor consolidado.</w:t>
+        <w:t>Migrar el tag de conversión de Google Ads (AW-593050363) dentro del contenedor consolidado.</w:t>
       </w:r>
     </w:p>
     <w:p>
@@ -107,11 +923,7 @@
         <w:pStyle w:val="ListBullet"/>
       </w:pPr>
       <w:r>
-        <w:rPr>
-          <w:color w:val="1A1E17"/>
-          <w:sz w:val="22"/>
-        </w:rPr>
-        <w:t>Verificar en el Asistente de Etiquetas de Google que no se disparen eventos duplicados en ninguna página.</w:t>
+        <w:t>Verificar en el Asistente de Etiquetas que no se disparen eventos duplicados.</w:t>
       </w:r>
     </w:p>
     <w:p>
@@ -119,20 +931,14 @@
         <w:pStyle w:val="ListBullet"/>
       </w:pPr>
       <w:r>
-        <w:rPr>
-          <w:color w:val="1A1E17"/>
-          <w:sz w:val="22"/>
-        </w:rPr>
-        <w:t>Documentar el contenedor GTM vigente y entregar acceso de administrador al equipo interno.</w:t>
+        <w:t>Documentar el contenedor GTM vigente y entregar acceso de administrador.</w:t>
       </w:r>
     </w:p>
     <w:p>
+      <w:pPr>
+        <w:pStyle w:val="Heading1"/>
+      </w:pPr>
       <w:r>
-        <w:rPr>
-          <w:b/>
-          <w:color w:val="2C3A63"/>
-          <w:sz w:val="28"/>
-        </w:rPr>
         <w:t>Prioridad 2 — Rendimiento</w:t>
       </w:r>
     </w:p>
@@ -141,11 +947,7 @@
         <w:pStyle w:val="ListBullet"/>
       </w:pPr>
       <w:r>
-        <w:rPr>
-          <w:color w:val="1A1E17"/>
-          <w:sz w:val="22"/>
-        </w:rPr>
-        <w:t>Combinar y minificar las hojas de estilo CSS de Elementor (actualmente se cargan 50 archivos por separado en la home).</w:t>
+        <w:t>Combinar y minificar las 51 hojas de estilo CSS de Elementor.</w:t>
       </w:r>
     </w:p>
     <w:p>
@@ -153,11 +955,7 @@
         <w:pStyle w:val="ListBullet"/>
       </w:pPr>
       <w:r>
-        <w:rPr>
-          <w:color w:val="1A1E17"/>
-          <w:sz w:val="22"/>
-        </w:rPr>
-        <w:t>Revisar y activar la opción de combinación de CSS en WP Rocket, o ajustar el "print method" de Elementor si la fragmentación viene de ahí.</w:t>
+        <w:t>Revisar/activar la combinación de CSS en WP Rocket o el print method de Elementor.</w:t>
       </w:r>
     </w:p>
     <w:p>
@@ -165,20 +963,30 @@
         <w:pStyle w:val="ListBullet"/>
       </w:pPr>
       <w:r>
-        <w:rPr>
-          <w:color w:val="1A1E17"/>
-          <w:sz w:val="22"/>
-        </w:rPr>
-        <w:t>Validar el resultado con PageSpeed Insights / Core Web Vitals después del cambio.</w:t>
+        <w:t>Nuevo: reducir JavaScript no utilizado (~294 KiB).</w:t>
       </w:r>
     </w:p>
     <w:p>
+      <w:pPr>
+        <w:pStyle w:val="ListBullet"/>
+      </w:pPr>
       <w:r>
-        <w:rPr>
-          <w:b/>
-          <w:color w:val="2C3A63"/>
-          <w:sz w:val="28"/>
-        </w:rPr>
+        <w:t>Nuevo: atacar directamente el LCP de 12.4s.</w:t>
+      </w:r>
+    </w:p>
+    <w:p>
+      <w:pPr>
+        <w:pStyle w:val="ListBullet"/>
+      </w:pPr>
+      <w:r>
+        <w:t>Validar con PageSpeed Insights / Core Web Vitals tras cada cambio.</w:t>
+      </w:r>
+    </w:p>
+    <w:p>
+      <w:pPr>
+        <w:pStyle w:val="Heading1"/>
+      </w:pPr>
+      <w:r>
         <w:t>Prioridad 3 — Accesibilidad e imágenes</w:t>
       </w:r>
     </w:p>
@@ -187,11 +995,7 @@
         <w:pStyle w:val="ListBullet"/>
       </w:pPr>
       <w:r>
-        <w:rPr>
-          <w:color w:val="1A1E17"/>
-          <w:sz w:val="22"/>
-        </w:rPr>
-        <w:t>Completar el atributo alt en todas las imágenes de contenido (fotografías, ilustraciones) que actualmente lo tienen vacío. No modificar el alt vacío de imágenes puramente decorativas.</w:t>
+        <w:t>Completar alt en imágenes de contenido (hoy 42% de cobertura en la home).</w:t>
       </w:r>
     </w:p>
     <w:p>
@@ -199,20 +1003,14 @@
         <w:pStyle w:val="ListBullet"/>
       </w:pPr>
       <w:r>
-        <w:rPr>
-          <w:color w:val="1A1E17"/>
-          <w:sz w:val="22"/>
-        </w:rPr>
-        <w:t>Ampliar la cobertura de loading="lazy" a las imágenes fuera del primer scroll.</w:t>
+        <w:t>Ampliar loading=lazy a imágenes fuera del primer scroll (hoy 41%).</w:t>
       </w:r>
     </w:p>
     <w:p>
+      <w:pPr>
+        <w:pStyle w:val="Heading1"/>
+      </w:pPr>
       <w:r>
-        <w:rPr>
-          <w:b/>
-          <w:color w:val="2C3A63"/>
-          <w:sz w:val="28"/>
-        </w:rPr>
         <w:t>Prioridad 4 — Actualización de plataforma</w:t>
       </w:r>
     </w:p>
@@ -221,11 +1019,7 @@
         <w:pStyle w:val="ListBullet"/>
       </w:pPr>
       <w:r>
-        <w:rPr>
-          <w:color w:val="1A1E17"/>
-          <w:sz w:val="22"/>
-        </w:rPr>
-        <w:t>Actualizar WordPress a la versión estable más reciente (previo respaldo completo y prueba en entorno de staging).</w:t>
+        <w:t>Actualizar WordPress (hoy 6.8.8) — servicios. ya corre 7.0.4, confirma viabilidad.</w:t>
       </w:r>
     </w:p>
     <w:p>
@@ -233,11 +1027,7 @@
         <w:pStyle w:val="ListBullet"/>
       </w:pPr>
       <w:r>
-        <w:rPr>
-          <w:color w:val="1A1E17"/>
-          <w:sz w:val="22"/>
-        </w:rPr>
-        <w:t>Actualizar Elementor y Elementor Pro a la versión más reciente.</w:t>
+        <w:t>Actualizar Elementor (4.1.4) y Elementor Pro (4.1.2).</w:t>
       </w:r>
     </w:p>
     <w:p>
@@ -245,20 +1035,14 @@
         <w:pStyle w:val="ListBullet"/>
       </w:pPr>
       <w:r>
-        <w:rPr>
-          <w:color w:val="1A1E17"/>
-          <w:sz w:val="22"/>
-        </w:rPr>
-        <w:t>Confirmar compatibilidad de plugins activos antes de cada actualización.</w:t>
+        <w:t>Confirmar compatibilidad de plugins antes de actualizar, con staging y respaldo.</w:t>
       </w:r>
     </w:p>
     <w:p>
+      <w:pPr>
+        <w:pStyle w:val="Heading1"/>
+      </w:pPr>
       <w:r>
-        <w:rPr>
-          <w:b/>
-          <w:color w:val="2C3A63"/>
-          <w:sz w:val="28"/>
-        </w:rPr>
         <w:t>Prioridad 5 — Datos estructurados y metadatos</w:t>
       </w:r>
     </w:p>
@@ -267,11 +1051,7 @@
         <w:pStyle w:val="ListBullet"/>
       </w:pPr>
       <w:r>
-        <w:rPr>
-          <w:color w:val="1A1E17"/>
-          <w:sz w:val="22"/>
-        </w:rPr>
-        <w:t>Implementar schema LocalBusiness para el negocio.</w:t>
+        <w:t>Implementar schema LocalBusiness.</w:t>
       </w:r>
     </w:p>
     <w:p>
@@ -279,11 +1059,7 @@
         <w:pStyle w:val="ListBullet"/>
       </w:pPr>
       <w:r>
-        <w:rPr>
-          <w:color w:val="1A1E17"/>
-          <w:sz w:val="22"/>
-        </w:rPr>
-        <w:t>Implementar schema Service en cada una de las 6 páginas de servicio.</w:t>
+        <w:t>Implementar schema Service en las 6 páginas de servicio.</w:t>
       </w:r>
     </w:p>
     <w:p>
@@ -291,11 +1067,7 @@
         <w:pStyle w:val="ListBullet"/>
       </w:pPr>
       <w:r>
-        <w:rPr>
-          <w:color w:val="1A1E17"/>
-          <w:sz w:val="22"/>
-        </w:rPr>
-        <w:t>Ajustar la imagen Open Graph a proporción 1.91:1 (1200×630) en lugar de la imagen cuadrada actual.</w:t>
+        <w:t>Ajustar imagen Open Graph a 1200x630 (hoy cuadrada 1080x1080).</w:t>
       </w:r>
     </w:p>
     <w:p>
@@ -303,11 +1075,7 @@
         <w:pStyle w:val="ListBullet"/>
       </w:pPr>
       <w:r>
-        <w:rPr>
-          <w:color w:val="1A1E17"/>
-          <w:sz w:val="22"/>
-        </w:rPr>
-        <w:t>Completar las etiquetas twitter:title, twitter:description y twitter:image.</w:t>
+        <w:t>Completar twitter:title, twitter:description y twitter:image.</w:t>
       </w:r>
     </w:p>
     <w:p>
@@ -315,20 +1083,14 @@
         <w:pStyle w:val="ListBullet"/>
       </w:pPr>
       <w:r>
-        <w:rPr>
-          <w:color w:val="1A1E17"/>
-          <w:sz w:val="22"/>
-        </w:rPr>
-        <w:t>Ampliar la meta description a 150–160 caracteres.</w:t>
+        <w:t>Ampliar meta description a 150-160 caracteres (hoy 135).</w:t>
       </w:r>
     </w:p>
     <w:p>
+      <w:pPr>
+        <w:pStyle w:val="Heading1"/>
+      </w:pPr>
       <w:r>
-        <w:rPr>
-          <w:b/>
-          <w:color w:val="2C3A63"/>
-          <w:sz w:val="28"/>
-        </w:rPr>
         <w:t>Prioridad 6 — Otros ajustes</w:t>
       </w:r>
     </w:p>
@@ -337,11 +1099,7 @@
         <w:pStyle w:val="ListBullet"/>
       </w:pPr>
       <w:r>
-        <w:rPr>
-          <w:color w:val="1A1E17"/>
-          <w:sz w:val="22"/>
-        </w:rPr>
-        <w:t>Apuntar los enlaces del menú directamente a la URL canónica de /servicios/ y /blog/ para evitar el salto por redirección 301.</w:t>
+        <w:t>Apuntar enlaces de menú a /servicios/ y /blog/ con barra final.</w:t>
       </w:r>
     </w:p>
     <w:p>
@@ -349,11 +1107,7 @@
         <w:pStyle w:val="ListBullet"/>
       </w:pPr>
       <w:r>
-        <w:rPr>
-          <w:color w:val="1A1E17"/>
-          <w:sz w:val="22"/>
-        </w:rPr>
-        <w:t>Agregar la cabecera Strict-Transport-Security.</w:t>
+        <w:t>Agregar cabecera Strict-Transport-Security.</w:t>
       </w:r>
     </w:p>
     <w:p>
@@ -361,65 +1115,44 @@
         <w:pStyle w:val="ListBullet"/>
       </w:pPr>
       <w:r>
-        <w:rPr>
-          <w:color w:val="1A1E17"/>
-          <w:sz w:val="22"/>
-        </w:rPr>
-        <w:t>Resolver la respuesta 404 de /favicon.ico en la raíz del dominio.</w:t>
+        <w:t>Resolver la respuesta 404 de /favicon.ico.</w:t>
       </w:r>
     </w:p>
     <w:p>
+      <w:pPr>
+        <w:pStyle w:val="Heading1"/>
+      </w:pPr>
       <w:r>
-        <w:rPr>
-          <w:b/>
-          <w:color w:val="2C3A63"/>
-          <w:sz w:val="28"/>
-        </w:rPr>
         <w:t>Criterios de aceptación</w:t>
       </w:r>
     </w:p>
     <w:tbl>
       <w:tblPr>
-        <w:tblStyle w:val="TableGrid"/>
+        <w:tblStyle w:val="LightGrid-Accent1"/>
         <w:tblW w:type="auto" w:w="0"/>
-        <w:jc w:val="left"/>
         <w:tblLook w:firstColumn="1" w:firstRow="1" w:lastColumn="0" w:lastRow="0" w:noHBand="0" w:noVBand="1" w:val="04A0"/>
       </w:tblPr>
       <w:tblGrid>
-        <w:gridCol w:w="4873"/>
-        <w:gridCol w:w="4873"/>
+        <w:gridCol w:w="4320"/>
+        <w:gridCol w:w="4320"/>
       </w:tblGrid>
       <w:tr>
         <w:tc>
           <w:tcPr>
-            <w:tcW w:type="dxa" w:w="4873"/>
-            <w:shd w:fill="2C3A63"/>
+            <w:tcW w:type="dxa" w:w="4320"/>
           </w:tcPr>
           <w:p>
-            <w:r/>
             <w:r>
-              <w:rPr>
-                <w:b/>
-                <w:color w:val="FFFFFF"/>
-                <w:sz w:val="20"/>
-              </w:rPr>
               <w:t>Punto</w:t>
             </w:r>
           </w:p>
         </w:tc>
         <w:tc>
           <w:tcPr>
-            <w:tcW w:type="dxa" w:w="4873"/>
-            <w:shd w:fill="2C3A63"/>
+            <w:tcW w:type="dxa" w:w="4320"/>
           </w:tcPr>
           <w:p>
-            <w:r/>
             <w:r>
-              <w:rPr>
-                <w:b/>
-                <w:color w:val="FFFFFF"/>
-                <w:sz w:val="20"/>
-              </w:rPr>
               <w:t>Cómo se valida</w:t>
             </w:r>
           </w:p>
@@ -428,31 +1161,21 @@
       <w:tr>
         <w:tc>
           <w:tcPr>
-            <w:tcW w:type="dxa" w:w="4873"/>
+            <w:tcW w:type="dxa" w:w="4320"/>
           </w:tcPr>
           <w:p>
-            <w:r/>
             <w:r>
-              <w:rPr>
-                <w:color w:val="1A1E17"/>
-                <w:sz w:val="20"/>
-              </w:rPr>
               <w:t>Tracking consolidado</w:t>
             </w:r>
           </w:p>
         </w:tc>
         <w:tc>
           <w:tcPr>
-            <w:tcW w:type="dxa" w:w="4873"/>
+            <w:tcW w:type="dxa" w:w="4320"/>
           </w:tcPr>
           <w:p>
-            <w:r/>
             <w:r>
-              <w:rPr>
-                <w:color w:val="1A1E17"/>
-                <w:sz w:val="20"/>
-              </w:rPr>
-              <w:t>Un solo contenedor GTM visible en el código fuente; sin eventos duplicados en el Asistente de Etiquetas</w:t>
+              <w:t>Un solo contenedor GTM visible; sin eventos duplicados.</w:t>
             </w:r>
           </w:p>
         </w:tc>
@@ -460,31 +1183,21 @@
       <w:tr>
         <w:tc>
           <w:tcPr>
-            <w:tcW w:type="dxa" w:w="4873"/>
+            <w:tcW w:type="dxa" w:w="4320"/>
           </w:tcPr>
           <w:p>
-            <w:r/>
             <w:r>
-              <w:rPr>
-                <w:color w:val="1A1E17"/>
-                <w:sz w:val="20"/>
-              </w:rPr>
               <w:t>CSS combinado</w:t>
             </w:r>
           </w:p>
         </w:tc>
         <w:tc>
           <w:tcPr>
-            <w:tcW w:type="dxa" w:w="4873"/>
+            <w:tcW w:type="dxa" w:w="4320"/>
           </w:tcPr>
           <w:p>
-            <w:r/>
             <w:r>
-              <w:rPr>
-                <w:color w:val="1A1E17"/>
-                <w:sz w:val="20"/>
-              </w:rPr>
-              <w:t>Menos de 10 peticiones de hojas de estilo en la home</w:t>
+              <w:t>Menos de 10 peticiones de hojas de estilo en la home.</w:t>
             </w:r>
           </w:p>
         </w:tc>
@@ -492,31 +1205,21 @@
       <w:tr>
         <w:tc>
           <w:tcPr>
-            <w:tcW w:type="dxa" w:w="4873"/>
+            <w:tcW w:type="dxa" w:w="4320"/>
           </w:tcPr>
           <w:p>
-            <w:r/>
             <w:r>
-              <w:rPr>
-                <w:color w:val="1A1E17"/>
-                <w:sz w:val="20"/>
-              </w:rPr>
-              <w:t>Imágenes con alt</w:t>
+              <w:t>LCP bajo control</w:t>
             </w:r>
           </w:p>
         </w:tc>
         <w:tc>
           <w:tcPr>
-            <w:tcW w:type="dxa" w:w="4873"/>
+            <w:tcW w:type="dxa" w:w="4320"/>
           </w:tcPr>
           <w:p>
-            <w:r/>
             <w:r>
-              <w:rPr>
-                <w:color w:val="1A1E17"/>
-                <w:sz w:val="20"/>
-              </w:rPr>
-              <w:t>100% de imágenes de contenido con alt descriptivo</w:t>
+              <w:t>Menos de 2.5s en PageSpeed Insights / Lighthouse.</w:t>
             </w:r>
           </w:p>
         </w:tc>
@@ -524,31 +1227,21 @@
       <w:tr>
         <w:tc>
           <w:tcPr>
-            <w:tcW w:type="dxa" w:w="4873"/>
+            <w:tcW w:type="dxa" w:w="4320"/>
           </w:tcPr>
           <w:p>
-            <w:r/>
             <w:r>
-              <w:rPr>
-                <w:color w:val="1A1E17"/>
-                <w:sz w:val="20"/>
-              </w:rPr>
-              <w:t>Plataforma actualizada</w:t>
+              <w:t>Imágenes con alt</w:t>
             </w:r>
           </w:p>
         </w:tc>
         <w:tc>
           <w:tcPr>
-            <w:tcW w:type="dxa" w:w="4873"/>
+            <w:tcW w:type="dxa" w:w="4320"/>
           </w:tcPr>
           <w:p>
-            <w:r/>
             <w:r>
-              <w:rPr>
-                <w:color w:val="1A1E17"/>
-                <w:sz w:val="20"/>
-              </w:rPr>
-              <w:t>Versión de WordPress y Elementor al día, confirmable en el panel de administración</w:t>
+              <w:t>100% de imágenes de contenido con alt descriptivo.</w:t>
             </w:r>
           </w:p>
         </w:tc>
@@ -556,40 +1249,51 @@
       <w:tr>
         <w:tc>
           <w:tcPr>
-            <w:tcW w:type="dxa" w:w="4873"/>
+            <w:tcW w:type="dxa" w:w="4320"/>
           </w:tcPr>
           <w:p>
-            <w:r/>
             <w:r>
-              <w:rPr>
-                <w:color w:val="1A1E17"/>
-                <w:sz w:val="20"/>
-              </w:rPr>
+              <w:t>Plataforma actualizada</w:t>
+            </w:r>
+          </w:p>
+        </w:tc>
+        <w:tc>
+          <w:tcPr>
+            <w:tcW w:type="dxa" w:w="4320"/>
+          </w:tcPr>
+          <w:p>
+            <w:r>
+              <w:t>Versión de WordPress y Elementor al día.</w:t>
+            </w:r>
+          </w:p>
+        </w:tc>
+      </w:tr>
+      <w:tr>
+        <w:tc>
+          <w:tcPr>
+            <w:tcW w:type="dxa" w:w="4320"/>
+          </w:tcPr>
+          <w:p>
+            <w:r>
               <w:t>Schema implementado</w:t>
             </w:r>
           </w:p>
         </w:tc>
         <w:tc>
           <w:tcPr>
-            <w:tcW w:type="dxa" w:w="4873"/>
+            <w:tcW w:type="dxa" w:w="4320"/>
           </w:tcPr>
           <w:p>
-            <w:r/>
             <w:r>
-              <w:rPr>
-                <w:color w:val="1A1E17"/>
-                <w:sz w:val="20"/>
-              </w:rPr>
-              <w:t>Validación sin errores en el Rich Results Test de Google</w:t>
+              <w:t>Validación sin errores en el Rich Results Test de Google.</w:t>
             </w:r>
           </w:p>
         </w:tc>
       </w:tr>
     </w:tbl>
-    <w:p/>
     <w:sectPr>
       <w:pgSz w:w="12240" w:h="15840"/>
-      <w:pgMar w:top="1134" w:right="1247" w:bottom="1134" w:left="1247" w:header="720" w:footer="720" w:gutter="0"/>
+      <w:pgMar w:top="1440" w:right="1800" w:bottom="1440" w:left="1800" w:header="720" w:footer="720" w:gutter="0"/>
       <w:cols w:space="720"/>
       <w:docGrid w:linePitch="360"/>
     </w:sectPr>
@@ -960,11 +1664,6 @@
     <w:name w:val="Normal"/>
     <w:qFormat/>
     <w:rsid w:val="00FC693F"/>
-    <w:rPr>
-      <w:rFonts w:ascii="Calibri" w:hAnsi="Calibri"/>
-      <w:color w:val="1A1E17"/>
-      <w:sz w:val="22"/>
-    </w:rPr>
   </w:style>
   <w:style w:type="paragraph" w:styleId="Header">
     <w:name w:val="header"/>

</xml_diff>